<commit_message>
Update document with copyright holder and author information
Modify the 'ya-slyshu-doc.docx' file in the public artifacts directory to include author and copyright holder details.

Replit-Commit-Author: Agent
Replit-Commit-Session-Id: 6084f161-c760-457f-ba94-7c8726496a8c
Replit-Commit-Checkpoint-Type: full_checkpoint
Replit-Commit-Event-Id: fb42d216-e31f-4770-b3c3-1c2897dd2dba
Replit-Commit-Screenshot-Url: https://storage.googleapis.com/screenshot-production-us-central1/796b8858-0fc4-47b5-8778-a0ce53a1834f/6084f161-c760-457f-ba94-7c8726496a8c/gXjb2VO
Replit-Helium-Checkpoint-Created: true
</commit_message>
<xml_diff>
--- a/artifacts/swaip/public/ya-slyshu-doc.docx
+++ b/artifacts/swaip/public/ya-slyshu-doc.docx
@@ -37,7 +37,7 @@
           <w:rFonts w:ascii="Times New Roman" w:hAnsi="Times New Roman"/>
           <w:sz w:val="24"/>
         </w:rPr>
-        <w:t>_____________________________________________</w:t>
+        <w:t>Маликов Данил Мирзанурович</w:t>
       </w:r>
     </w:p>
     <w:p>
@@ -62,7 +62,17 @@
           <w:rFonts w:ascii="Times New Roman" w:hAnsi="Times New Roman"/>
           <w:sz w:val="24"/>
         </w:rPr>
-        <w:t>_____________________________________________</w:t>
+        <w:t>Маликов Данил Мирзанурович</w:t>
+      </w:r>
+      <w:r>
+        <w:br/>
+      </w:r>
+      <w:r>
+        <w:rPr>
+          <w:rFonts w:ascii="Times New Roman" w:hAnsi="Times New Roman"/>
+          <w:sz w:val="24"/>
+        </w:rPr>
+        <w:t>проживает по адресу: Россия, Республика Татарстан, г. Набережные Челны, проспект Мира, 23</w:t>
       </w:r>
     </w:p>
     <w:p>

</xml_diff>